<commit_message>
Resolve the verb-lexicon trap: action x familiarity decides tier
The lexicon now emits an action class rather than a tier; a familiarity score
against a taught-as-content bucket and an exercise bucket combines with it in
a 2-D table. Adds the canonical_procedure table so the taught-verbatim set is
an exact lookup rather than fuzzy retrieval, plus difficulty-based
falsification and per-school overrides.

Co-Authored-By: Claude Opus 5 <noreply@anthropic.com>
Claude-Session: https://claude.ai/code/session_01SKQNiN3t1JyD8NZXguXbrf
</commit_message>
<xml_diff>
--- a/docs/Yaadhum — Complete Backend Logic.docx
+++ b/docs/Yaadhum — Complete Backend Logic.docx
@@ -3506,6 +3506,1289 @@
       </w:r>
       <w:r>
         <w:t xml:space="preserve"> — which reads as AP — but it is a standard NCERT theorem that students memorise, so its real demand is reproduction. Only the retrieval signal knows that.</w:t>
+      </w:r>
+    </w:p>
+    <w:p>
+      <w:pPr>
+        <w:pStyle w:val="Heading3"/>
+      </w:pPr>
+      <w:r>
+        <w:t>How signals 2 and 3 actually compose — the verb never outputs a tier</w:t>
+      </w:r>
+    </w:p>
+    <w:p>
+      <w:r>
+        <w:t>The verb lexicon on its own is wrong, and it is wrong in a predictable way. The fix is not a better lexicon; it is to stop asking the lexicon for a tier at all.</w:t>
+      </w:r>
+    </w:p>
+    <w:p>
+      <w:r>
+        <w:rPr>
+          <w:b/>
+        </w:rPr>
+        <w:t>Bloom level = action × familiarity.</w:t>
+      </w:r>
+      <w:r>
+        <w:t xml:space="preserve"> "Applying" means carrying out a known procedure in a </w:t>
+      </w:r>
+      <w:r>
+        <w:rPr>
+          <w:i/>
+        </w:rPr>
+        <w:t>new</w:t>
+      </w:r>
+      <w:r>
+        <w:t xml:space="preserve"> situation. If the exact task was taught and memorised, the same action is Remembering. So the lexicon outputs an </w:t>
+      </w:r>
+      <w:r>
+        <w:rPr>
+          <w:b/>
+        </w:rPr>
+        <w:t>action class</w:t>
+      </w:r>
+      <w:r>
+        <w:t>, and only the combination with a familiarity score produces a tier.</w:t>
+      </w:r>
+    </w:p>
+    <w:p>
+      <w:r>
+        <w:rPr>
+          <w:b/>
+        </w:rPr>
+        <w:t>Step 1 — the lexicon emits an action, not a tier</w:t>
+      </w:r>
+    </w:p>
+    <w:tbl>
+      <w:tblPr>
+        <w:tblStyle w:val="LightGrid-Accent1"/>
+        <w:tblW w:type="auto" w:w="0"/>
+        <w:tblLook w:firstColumn="1" w:firstRow="1" w:lastColumn="0" w:lastRow="0" w:noHBand="0" w:noVBand="1" w:val="04A0"/>
+      </w:tblPr>
+      <w:tblGrid>
+        <w:gridCol w:w="2556"/>
+        <w:gridCol w:w="2556"/>
+        <w:gridCol w:w="2556"/>
+        <w:gridCol w:w="2556"/>
+      </w:tblGrid>
+      <w:tr>
+        <w:tc>
+          <w:tcPr>
+            <w:tcW w:type="dxa" w:w="2556"/>
+          </w:tcPr>
+          <w:p>
+            <w:r>
+              <w:rPr>
+                <w:b/>
+                <w:sz w:val="17"/>
+              </w:rPr>
+            </w:r>
+            <w:r>
+              <w:rPr>
+                <w:b/>
+                <w:sz w:val="17"/>
+              </w:rPr>
+              <w:t>Action class</w:t>
+            </w:r>
+          </w:p>
+        </w:tc>
+        <w:tc>
+          <w:tcPr>
+            <w:tcW w:type="dxa" w:w="2556"/>
+          </w:tcPr>
+          <w:p>
+            <w:r>
+              <w:rPr>
+                <w:b/>
+                <w:sz w:val="17"/>
+              </w:rPr>
+            </w:r>
+            <w:r>
+              <w:rPr>
+                <w:b/>
+                <w:sz w:val="17"/>
+              </w:rPr>
+              <w:t>English triggers</w:t>
+            </w:r>
+          </w:p>
+        </w:tc>
+        <w:tc>
+          <w:tcPr>
+            <w:tcW w:type="dxa" w:w="2556"/>
+          </w:tcPr>
+          <w:p>
+            <w:r>
+              <w:rPr>
+                <w:b/>
+                <w:sz w:val="17"/>
+              </w:rPr>
+            </w:r>
+            <w:r>
+              <w:rPr>
+                <w:b/>
+                <w:sz w:val="17"/>
+              </w:rPr>
+              <w:t>Hindi</w:t>
+            </w:r>
+          </w:p>
+        </w:tc>
+        <w:tc>
+          <w:tcPr>
+            <w:tcW w:type="dxa" w:w="2556"/>
+          </w:tcPr>
+          <w:p>
+            <w:r>
+              <w:rPr>
+                <w:b/>
+                <w:sz w:val="17"/>
+              </w:rPr>
+            </w:r>
+            <w:r>
+              <w:rPr>
+                <w:b/>
+                <w:sz w:val="17"/>
+              </w:rPr>
+              <w:t>Tamil</w:t>
+            </w:r>
+          </w:p>
+        </w:tc>
+      </w:tr>
+      <w:tr>
+        <w:tc>
+          <w:tcPr>
+            <w:tcW w:type="dxa" w:w="2556"/>
+          </w:tcPr>
+          <w:p>
+            <w:r>
+              <w:rPr>
+                <w:sz w:val="17"/>
+              </w:rPr>
+            </w:r>
+            <w:r>
+              <w:rPr>
+                <w:sz w:val="17"/>
+              </w:rPr>
+              <w:t>RECALL</w:t>
+            </w:r>
+          </w:p>
+        </w:tc>
+        <w:tc>
+          <w:tcPr>
+            <w:tcW w:type="dxa" w:w="2556"/>
+          </w:tcPr>
+          <w:p>
+            <w:r>
+              <w:rPr>
+                <w:sz w:val="17"/>
+              </w:rPr>
+            </w:r>
+            <w:r>
+              <w:rPr>
+                <w:sz w:val="17"/>
+              </w:rPr>
+              <w:t>state, name, list, define, write the value of</w:t>
+            </w:r>
+          </w:p>
+        </w:tc>
+        <w:tc>
+          <w:tcPr>
+            <w:tcW w:type="dxa" w:w="2556"/>
+          </w:tcPr>
+          <w:p>
+            <w:r>
+              <w:rPr>
+                <w:sz w:val="17"/>
+              </w:rPr>
+            </w:r>
+            <w:r>
+              <w:rPr>
+                <w:sz w:val="17"/>
+              </w:rPr>
+              <w:t>बताइए, लिखिए</w:t>
+            </w:r>
+          </w:p>
+        </w:tc>
+        <w:tc>
+          <w:tcPr>
+            <w:tcW w:type="dxa" w:w="2556"/>
+          </w:tcPr>
+          <w:p>
+            <w:r>
+              <w:rPr>
+                <w:sz w:val="17"/>
+              </w:rPr>
+            </w:r>
+            <w:r>
+              <w:rPr>
+                <w:sz w:val="17"/>
+              </w:rPr>
+              <w:t>எழுதுக</w:t>
+            </w:r>
+          </w:p>
+        </w:tc>
+      </w:tr>
+      <w:tr>
+        <w:tc>
+          <w:tcPr>
+            <w:tcW w:type="dxa" w:w="2556"/>
+          </w:tcPr>
+          <w:p>
+            <w:r>
+              <w:rPr>
+                <w:sz w:val="17"/>
+              </w:rPr>
+            </w:r>
+            <w:r>
+              <w:rPr>
+                <w:sz w:val="17"/>
+              </w:rPr>
+              <w:t>EXPLAIN</w:t>
+            </w:r>
+          </w:p>
+        </w:tc>
+        <w:tc>
+          <w:tcPr>
+            <w:tcW w:type="dxa" w:w="2556"/>
+          </w:tcPr>
+          <w:p>
+            <w:r>
+              <w:rPr>
+                <w:sz w:val="17"/>
+              </w:rPr>
+            </w:r>
+            <w:r>
+              <w:rPr>
+                <w:sz w:val="17"/>
+              </w:rPr>
+              <w:t>explain, describe, what is meant by</w:t>
+            </w:r>
+          </w:p>
+        </w:tc>
+        <w:tc>
+          <w:tcPr>
+            <w:tcW w:type="dxa" w:w="2556"/>
+          </w:tcPr>
+          <w:p>
+            <w:r>
+              <w:rPr>
+                <w:sz w:val="17"/>
+              </w:rPr>
+            </w:r>
+            <w:r>
+              <w:rPr>
+                <w:sz w:val="17"/>
+              </w:rPr>
+              <w:t>समझाइए, वर्णन कीजिए</w:t>
+            </w:r>
+          </w:p>
+        </w:tc>
+        <w:tc>
+          <w:tcPr>
+            <w:tcW w:type="dxa" w:w="2556"/>
+          </w:tcPr>
+          <w:p>
+            <w:r>
+              <w:rPr>
+                <w:sz w:val="17"/>
+              </w:rPr>
+            </w:r>
+            <w:r>
+              <w:rPr>
+                <w:sz w:val="17"/>
+              </w:rPr>
+              <w:t>விளக்குக</w:t>
+            </w:r>
+          </w:p>
+        </w:tc>
+      </w:tr>
+      <w:tr>
+        <w:tc>
+          <w:tcPr>
+            <w:tcW w:type="dxa" w:w="2556"/>
+          </w:tcPr>
+          <w:p>
+            <w:r>
+              <w:rPr>
+                <w:sz w:val="17"/>
+              </w:rPr>
+            </w:r>
+            <w:r>
+              <w:rPr>
+                <w:sz w:val="17"/>
+              </w:rPr>
+              <w:t>EXECUTE</w:t>
+            </w:r>
+          </w:p>
+        </w:tc>
+        <w:tc>
+          <w:tcPr>
+            <w:tcW w:type="dxa" w:w="2556"/>
+          </w:tcPr>
+          <w:p>
+            <w:r>
+              <w:rPr>
+                <w:sz w:val="17"/>
+              </w:rPr>
+            </w:r>
+            <w:r>
+              <w:rPr>
+                <w:sz w:val="17"/>
+              </w:rPr>
+              <w:t>find, calculate, solve, determine, evaluate (numeric)</w:t>
+            </w:r>
+          </w:p>
+        </w:tc>
+        <w:tc>
+          <w:tcPr>
+            <w:tcW w:type="dxa" w:w="2556"/>
+          </w:tcPr>
+          <w:p>
+            <w:r>
+              <w:rPr>
+                <w:sz w:val="17"/>
+              </w:rPr>
+            </w:r>
+            <w:r>
+              <w:rPr>
+                <w:sz w:val="17"/>
+              </w:rPr>
+              <w:t>ज्ञात कीजिए, हल कीजिए</w:t>
+            </w:r>
+          </w:p>
+        </w:tc>
+        <w:tc>
+          <w:tcPr>
+            <w:tcW w:type="dxa" w:w="2556"/>
+          </w:tcPr>
+          <w:p>
+            <w:r>
+              <w:rPr>
+                <w:sz w:val="17"/>
+              </w:rPr>
+            </w:r>
+            <w:r>
+              <w:rPr>
+                <w:sz w:val="17"/>
+              </w:rPr>
+              <w:t>கண்டறிக, தீர்க்க</w:t>
+            </w:r>
+          </w:p>
+        </w:tc>
+      </w:tr>
+      <w:tr>
+        <w:tc>
+          <w:tcPr>
+            <w:tcW w:type="dxa" w:w="2556"/>
+          </w:tcPr>
+          <w:p>
+            <w:r>
+              <w:rPr>
+                <w:sz w:val="17"/>
+              </w:rPr>
+            </w:r>
+            <w:r>
+              <w:rPr>
+                <w:sz w:val="17"/>
+              </w:rPr>
+              <w:t>PROVE</w:t>
+            </w:r>
+          </w:p>
+        </w:tc>
+        <w:tc>
+          <w:tcPr>
+            <w:tcW w:type="dxa" w:w="2556"/>
+          </w:tcPr>
+          <w:p>
+            <w:r>
+              <w:rPr>
+                <w:sz w:val="17"/>
+              </w:rPr>
+            </w:r>
+            <w:r>
+              <w:rPr>
+                <w:sz w:val="17"/>
+              </w:rPr>
+              <w:t>prove, show that, verify</w:t>
+            </w:r>
+          </w:p>
+        </w:tc>
+        <w:tc>
+          <w:tcPr>
+            <w:tcW w:type="dxa" w:w="2556"/>
+          </w:tcPr>
+          <w:p>
+            <w:r>
+              <w:rPr>
+                <w:sz w:val="17"/>
+              </w:rPr>
+            </w:r>
+            <w:r>
+              <w:rPr>
+                <w:sz w:val="17"/>
+              </w:rPr>
+              <w:t>सिद्ध कीजिए</w:t>
+            </w:r>
+          </w:p>
+        </w:tc>
+        <w:tc>
+          <w:tcPr>
+            <w:tcW w:type="dxa" w:w="2556"/>
+          </w:tcPr>
+          <w:p>
+            <w:r>
+              <w:rPr>
+                <w:sz w:val="17"/>
+              </w:rPr>
+            </w:r>
+            <w:r>
+              <w:rPr>
+                <w:sz w:val="17"/>
+              </w:rPr>
+              <w:t>நிரூபிக்க</w:t>
+            </w:r>
+          </w:p>
+        </w:tc>
+      </w:tr>
+      <w:tr>
+        <w:tc>
+          <w:tcPr>
+            <w:tcW w:type="dxa" w:w="2556"/>
+          </w:tcPr>
+          <w:p>
+            <w:r>
+              <w:rPr>
+                <w:sz w:val="17"/>
+              </w:rPr>
+            </w:r>
+            <w:r>
+              <w:rPr>
+                <w:sz w:val="17"/>
+              </w:rPr>
+              <w:t>APPLY-IN-CONTEXT</w:t>
+            </w:r>
+          </w:p>
+        </w:tc>
+        <w:tc>
+          <w:tcPr>
+            <w:tcW w:type="dxa" w:w="2556"/>
+          </w:tcPr>
+          <w:p>
+            <w:r>
+              <w:rPr>
+                <w:sz w:val="17"/>
+              </w:rPr>
+            </w:r>
+            <w:r>
+              <w:rPr>
+                <w:sz w:val="17"/>
+              </w:rPr>
+              <w:t>a word problem, a real-world frame, a case study</w:t>
+            </w:r>
+          </w:p>
+        </w:tc>
+        <w:tc>
+          <w:tcPr>
+            <w:tcW w:type="dxa" w:w="2556"/>
+          </w:tcPr>
+          <w:p>
+            <w:r>
+              <w:rPr>
+                <w:sz w:val="17"/>
+              </w:rPr>
+            </w:r>
+            <w:r>
+              <w:rPr>
+                <w:sz w:val="17"/>
+              </w:rPr>
+              <w:t>—</w:t>
+            </w:r>
+          </w:p>
+        </w:tc>
+        <w:tc>
+          <w:tcPr>
+            <w:tcW w:type="dxa" w:w="2556"/>
+          </w:tcPr>
+          <w:p>
+            <w:r>
+              <w:rPr>
+                <w:sz w:val="17"/>
+              </w:rPr>
+            </w:r>
+            <w:r>
+              <w:rPr>
+                <w:sz w:val="17"/>
+              </w:rPr>
+              <w:t>—</w:t>
+            </w:r>
+          </w:p>
+        </w:tc>
+      </w:tr>
+      <w:tr>
+        <w:tc>
+          <w:tcPr>
+            <w:tcW w:type="dxa" w:w="2556"/>
+          </w:tcPr>
+          <w:p>
+            <w:r>
+              <w:rPr>
+                <w:sz w:val="17"/>
+              </w:rPr>
+            </w:r>
+            <w:r>
+              <w:rPr>
+                <w:sz w:val="17"/>
+              </w:rPr>
+              <w:t>ANALYSE / EVALUATE / CREATE</w:t>
+            </w:r>
+          </w:p>
+        </w:tc>
+        <w:tc>
+          <w:tcPr>
+            <w:tcW w:type="dxa" w:w="2556"/>
+          </w:tcPr>
+          <w:p>
+            <w:r>
+              <w:rPr>
+                <w:sz w:val="17"/>
+              </w:rPr>
+            </w:r>
+            <w:r>
+              <w:rPr>
+                <w:sz w:val="17"/>
+              </w:rPr>
+              <w:t>justify, compare, comment, criticise, suggest, design, in your opinion</w:t>
+            </w:r>
+          </w:p>
+        </w:tc>
+        <w:tc>
+          <w:tcPr>
+            <w:tcW w:type="dxa" w:w="2556"/>
+          </w:tcPr>
+          <w:p>
+            <w:r>
+              <w:rPr>
+                <w:sz w:val="17"/>
+              </w:rPr>
+            </w:r>
+            <w:r>
+              <w:rPr>
+                <w:sz w:val="17"/>
+              </w:rPr>
+              <w:t>मूल्यांकन कीजिए, अपने विचार</w:t>
+            </w:r>
+          </w:p>
+        </w:tc>
+        <w:tc>
+          <w:tcPr>
+            <w:tcW w:type="dxa" w:w="2556"/>
+          </w:tcPr>
+          <w:p>
+            <w:r>
+              <w:rPr>
+                <w:sz w:val="17"/>
+              </w:rPr>
+            </w:r>
+            <w:r>
+              <w:rPr>
+                <w:sz w:val="17"/>
+              </w:rPr>
+              <w:t>மதிப்பிடுக, ஆய்க</w:t>
+            </w:r>
+          </w:p>
+        </w:tc>
+      </w:tr>
+    </w:tbl>
+    <w:p/>
+    <w:p>
+      <w:r>
+        <w:rPr>
+          <w:b/>
+        </w:rPr>
+        <w:t>Step 2 — a familiarity score F, against two separate buckets</w:t>
+      </w:r>
+    </w:p>
+    <w:p>
+      <w:r>
+        <w:t xml:space="preserve">Retrieve the normalised stem (numbers → </w:t>
+      </w:r>
+      <w:r>
+        <w:rPr>
+          <w:rFonts w:ascii="Consolas" w:hAnsi="Consolas"/>
+          <w:sz w:val="18"/>
+        </w:rPr>
+        <w:t>&lt;NUM&gt;</w:t>
+      </w:r>
+      <w:r>
+        <w:t xml:space="preserve">, names → </w:t>
+      </w:r>
+      <w:r>
+        <w:rPr>
+          <w:rFonts w:ascii="Consolas" w:hAnsi="Consolas"/>
+          <w:sz w:val="18"/>
+        </w:rPr>
+        <w:t>&lt;NAME&gt;</w:t>
+      </w:r>
+      <w:r>
+        <w:t>) against:</w:t>
+      </w:r>
+    </w:p>
+    <w:p>
+      <w:pPr>
+        <w:pStyle w:val="ListBullet"/>
+      </w:pPr>
+      <w:r>
+        <w:rPr>
+          <w:b/>
+        </w:rPr>
+        <w:t>Bucket T — taught as content.</w:t>
+      </w:r>
+      <w:r>
+        <w:t xml:space="preserve"> NCERT theorems, worked examples and solved examples *in the</w:t>
+      </w:r>
+    </w:p>
+    <w:p>
+      <w:r>
+        <w:t>chapter body*. A match here means the student has seen the answer written out.</w:t>
+      </w:r>
+    </w:p>
+    <w:p>
+      <w:pPr>
+        <w:pStyle w:val="ListBullet"/>
+      </w:pPr>
+      <w:r>
+        <w:rPr>
+          <w:b/>
+        </w:rPr>
+        <w:t>Bucket E — exercise practice.</w:t>
+      </w:r>
+      <w:r>
+        <w:t xml:space="preserve"> NCERT end-of-chapter exercises and the school's past papers.</w:t>
+      </w:r>
+    </w:p>
+    <w:p>
+      <w:r>
+        <w:rPr>
+          <w:rFonts w:ascii="Consolas" w:hAnsi="Consolas"/>
+          <w:sz w:val="18"/>
+        </w:rPr>
+        <w:t>F = max(cosine similarity)</w:t>
+      </w:r>
+      <w:r>
+        <w:t xml:space="preserve"> per bucket, with an exact-hash channel on top. A Bucket T match is much stronger evidence of reproduction than a Bucket E match.</w:t>
+      </w:r>
+    </w:p>
+    <w:p>
+      <w:r>
+        <w:rPr>
+          <w:b/>
+        </w:rPr>
+        <w:t>Step 3 — a 2-D table decides the tier</w:t>
+      </w:r>
+    </w:p>
+    <w:tbl>
+      <w:tblPr>
+        <w:tblStyle w:val="LightGrid-Accent1"/>
+        <w:tblW w:type="auto" w:w="0"/>
+        <w:tblLook w:firstColumn="1" w:firstRow="1" w:lastColumn="0" w:lastRow="0" w:noHBand="0" w:noVBand="1" w:val="04A0"/>
+      </w:tblPr>
+      <w:tblGrid>
+        <w:gridCol w:w="2556"/>
+        <w:gridCol w:w="2556"/>
+        <w:gridCol w:w="2556"/>
+        <w:gridCol w:w="2556"/>
+      </w:tblGrid>
+      <w:tr>
+        <w:tc>
+          <w:tcPr>
+            <w:tcW w:type="dxa" w:w="2556"/>
+          </w:tcPr>
+          <w:p>
+            <w:r>
+              <w:rPr>
+                <w:b/>
+                <w:sz w:val="17"/>
+              </w:rPr>
+            </w:r>
+          </w:p>
+        </w:tc>
+        <w:tc>
+          <w:tcPr>
+            <w:tcW w:type="dxa" w:w="2556"/>
+          </w:tcPr>
+          <w:p>
+            <w:r>
+              <w:rPr>
+                <w:b/>
+                <w:sz w:val="17"/>
+              </w:rPr>
+            </w:r>
+            <w:r>
+              <w:rPr>
+                <w:b/>
+                <w:sz w:val="17"/>
+              </w:rPr>
+              <w:t>F ≥ 0.85 — verbatim or near</w:t>
+            </w:r>
+          </w:p>
+        </w:tc>
+        <w:tc>
+          <w:tcPr>
+            <w:tcW w:type="dxa" w:w="2556"/>
+          </w:tcPr>
+          <w:p>
+            <w:r>
+              <w:rPr>
+                <w:b/>
+                <w:sz w:val="17"/>
+              </w:rPr>
+            </w:r>
+            <w:r>
+              <w:rPr>
+                <w:b/>
+                <w:sz w:val="17"/>
+              </w:rPr>
+              <w:t>0.55 ≤ F &lt; 0.85 — same method, new numbers or frame</w:t>
+            </w:r>
+          </w:p>
+        </w:tc>
+        <w:tc>
+          <w:tcPr>
+            <w:tcW w:type="dxa" w:w="2556"/>
+          </w:tcPr>
+          <w:p>
+            <w:r>
+              <w:rPr>
+                <w:b/>
+                <w:sz w:val="17"/>
+              </w:rPr>
+            </w:r>
+            <w:r>
+              <w:rPr>
+                <w:b/>
+                <w:sz w:val="17"/>
+              </w:rPr>
+              <w:t>F &lt; 0.55 — novel</w:t>
+            </w:r>
+          </w:p>
+        </w:tc>
+      </w:tr>
+      <w:tr>
+        <w:tc>
+          <w:tcPr>
+            <w:tcW w:type="dxa" w:w="2556"/>
+          </w:tcPr>
+          <w:p>
+            <w:r>
+              <w:rPr>
+                <w:sz w:val="17"/>
+              </w:rPr>
+            </w:r>
+            <w:r>
+              <w:rPr>
+                <w:sz w:val="17"/>
+              </w:rPr>
+              <w:t>RECALL · EXPLAIN</w:t>
+            </w:r>
+          </w:p>
+        </w:tc>
+        <w:tc>
+          <w:tcPr>
+            <w:tcW w:type="dxa" w:w="2556"/>
+          </w:tcPr>
+          <w:p>
+            <w:r>
+              <w:rPr>
+                <w:sz w:val="17"/>
+              </w:rPr>
+            </w:r>
+            <w:r>
+              <w:rPr>
+                <w:sz w:val="17"/>
+              </w:rPr>
+              <w:t>R&amp;U</w:t>
+            </w:r>
+          </w:p>
+        </w:tc>
+        <w:tc>
+          <w:tcPr>
+            <w:tcW w:type="dxa" w:w="2556"/>
+          </w:tcPr>
+          <w:p>
+            <w:r>
+              <w:rPr>
+                <w:sz w:val="17"/>
+              </w:rPr>
+            </w:r>
+            <w:r>
+              <w:rPr>
+                <w:sz w:val="17"/>
+              </w:rPr>
+              <w:t>R&amp;U</w:t>
+            </w:r>
+          </w:p>
+        </w:tc>
+        <w:tc>
+          <w:tcPr>
+            <w:tcW w:type="dxa" w:w="2556"/>
+          </w:tcPr>
+          <w:p>
+            <w:r>
+              <w:rPr>
+                <w:sz w:val="17"/>
+              </w:rPr>
+            </w:r>
+            <w:r>
+              <w:rPr>
+                <w:sz w:val="17"/>
+              </w:rPr>
+              <w:t>R&amp;U</w:t>
+            </w:r>
+          </w:p>
+        </w:tc>
+      </w:tr>
+      <w:tr>
+        <w:tc>
+          <w:tcPr>
+            <w:tcW w:type="dxa" w:w="2556"/>
+          </w:tcPr>
+          <w:p>
+            <w:r>
+              <w:rPr>
+                <w:sz w:val="17"/>
+              </w:rPr>
+            </w:r>
+            <w:r>
+              <w:rPr>
+                <w:b/>
+                <w:sz w:val="17"/>
+              </w:rPr>
+              <w:t>EXECUTE · PROVE</w:t>
+            </w:r>
+          </w:p>
+        </w:tc>
+        <w:tc>
+          <w:tcPr>
+            <w:tcW w:type="dxa" w:w="2556"/>
+          </w:tcPr>
+          <w:p>
+            <w:r>
+              <w:rPr>
+                <w:sz w:val="17"/>
+              </w:rPr>
+            </w:r>
+            <w:r>
+              <w:rPr>
+                <w:b/>
+                <w:sz w:val="17"/>
+              </w:rPr>
+              <w:t>R&amp;U</w:t>
+            </w:r>
+            <w:r>
+              <w:rPr>
+                <w:sz w:val="17"/>
+              </w:rPr>
+              <w:t xml:space="preserve"> ← </w:t>
+            </w:r>
+            <w:r>
+              <w:rPr>
+                <w:i/>
+                <w:sz w:val="17"/>
+              </w:rPr>
+              <w:t>the √5 case</w:t>
+            </w:r>
+          </w:p>
+        </w:tc>
+        <w:tc>
+          <w:tcPr>
+            <w:tcW w:type="dxa" w:w="2556"/>
+          </w:tcPr>
+          <w:p>
+            <w:r>
+              <w:rPr>
+                <w:sz w:val="17"/>
+              </w:rPr>
+            </w:r>
+            <w:r>
+              <w:rPr>
+                <w:b/>
+                <w:sz w:val="17"/>
+              </w:rPr>
+              <w:t>AP</w:t>
+            </w:r>
+          </w:p>
+        </w:tc>
+        <w:tc>
+          <w:tcPr>
+            <w:tcW w:type="dxa" w:w="2556"/>
+          </w:tcPr>
+          <w:p>
+            <w:r>
+              <w:rPr>
+                <w:sz w:val="17"/>
+              </w:rPr>
+            </w:r>
+            <w:r>
+              <w:rPr>
+                <w:sz w:val="17"/>
+              </w:rPr>
+              <w:t>AEC</w:t>
+            </w:r>
+          </w:p>
+        </w:tc>
+      </w:tr>
+      <w:tr>
+        <w:tc>
+          <w:tcPr>
+            <w:tcW w:type="dxa" w:w="2556"/>
+          </w:tcPr>
+          <w:p>
+            <w:r>
+              <w:rPr>
+                <w:sz w:val="17"/>
+              </w:rPr>
+            </w:r>
+            <w:r>
+              <w:rPr>
+                <w:sz w:val="17"/>
+              </w:rPr>
+              <w:t>APPLY-IN-CONTEXT</w:t>
+            </w:r>
+          </w:p>
+        </w:tc>
+        <w:tc>
+          <w:tcPr>
+            <w:tcW w:type="dxa" w:w="2556"/>
+          </w:tcPr>
+          <w:p>
+            <w:r>
+              <w:rPr>
+                <w:sz w:val="17"/>
+              </w:rPr>
+            </w:r>
+            <w:r>
+              <w:rPr>
+                <w:sz w:val="17"/>
+              </w:rPr>
+              <w:t>AP</w:t>
+            </w:r>
+          </w:p>
+        </w:tc>
+        <w:tc>
+          <w:tcPr>
+            <w:tcW w:type="dxa" w:w="2556"/>
+          </w:tcPr>
+          <w:p>
+            <w:r>
+              <w:rPr>
+                <w:sz w:val="17"/>
+              </w:rPr>
+            </w:r>
+            <w:r>
+              <w:rPr>
+                <w:sz w:val="17"/>
+              </w:rPr>
+              <w:t>AP</w:t>
+            </w:r>
+          </w:p>
+        </w:tc>
+        <w:tc>
+          <w:tcPr>
+            <w:tcW w:type="dxa" w:w="2556"/>
+          </w:tcPr>
+          <w:p>
+            <w:r>
+              <w:rPr>
+                <w:sz w:val="17"/>
+              </w:rPr>
+            </w:r>
+            <w:r>
+              <w:rPr>
+                <w:sz w:val="17"/>
+              </w:rPr>
+              <w:t>AEC</w:t>
+            </w:r>
+          </w:p>
+        </w:tc>
+      </w:tr>
+      <w:tr>
+        <w:tc>
+          <w:tcPr>
+            <w:tcW w:type="dxa" w:w="2556"/>
+          </w:tcPr>
+          <w:p>
+            <w:r>
+              <w:rPr>
+                <w:sz w:val="17"/>
+              </w:rPr>
+            </w:r>
+            <w:r>
+              <w:rPr>
+                <w:sz w:val="17"/>
+              </w:rPr>
+              <w:t>ANALYSE · EVALUATE · CREATE</w:t>
+            </w:r>
+          </w:p>
+        </w:tc>
+        <w:tc>
+          <w:tcPr>
+            <w:tcW w:type="dxa" w:w="2556"/>
+          </w:tcPr>
+          <w:p>
+            <w:r>
+              <w:rPr>
+                <w:sz w:val="17"/>
+              </w:rPr>
+            </w:r>
+            <w:r>
+              <w:rPr>
+                <w:sz w:val="17"/>
+              </w:rPr>
+              <w:t>AP</w:t>
+            </w:r>
+          </w:p>
+        </w:tc>
+        <w:tc>
+          <w:tcPr>
+            <w:tcW w:type="dxa" w:w="2556"/>
+          </w:tcPr>
+          <w:p>
+            <w:r>
+              <w:rPr>
+                <w:sz w:val="17"/>
+              </w:rPr>
+            </w:r>
+            <w:r>
+              <w:rPr>
+                <w:sz w:val="17"/>
+              </w:rPr>
+              <w:t>AEC</w:t>
+            </w:r>
+          </w:p>
+        </w:tc>
+        <w:tc>
+          <w:tcPr>
+            <w:tcW w:type="dxa" w:w="2556"/>
+          </w:tcPr>
+          <w:p>
+            <w:r>
+              <w:rPr>
+                <w:sz w:val="17"/>
+              </w:rPr>
+            </w:r>
+            <w:r>
+              <w:rPr>
+                <w:sz w:val="17"/>
+              </w:rPr>
+              <w:t>AEC</w:t>
+            </w:r>
+          </w:p>
+        </w:tc>
+      </w:tr>
+    </w:tbl>
+    <w:p/>
+    <w:p>
+      <w:r>
+        <w:t>Worked through:</w:t>
+      </w:r>
+    </w:p>
+    <w:p>
+      <w:pPr>
+        <w:pStyle w:val="ListBullet"/>
+      </w:pPr>
+      <w:r>
+        <w:rPr>
+          <w:i/>
+        </w:rPr>
+        <w:t>"Prove that √5 is an irrational number."</w:t>
+      </w:r>
+      <w:r>
+        <w:t xml:space="preserve"> → action </w:t>
+      </w:r>
+      <w:r>
+        <w:rPr>
+          <w:b/>
+        </w:rPr>
+        <w:t>PROVE</w:t>
+      </w:r>
+      <w:r>
+        <w:t xml:space="preserve">, and it matches </w:t>
+      </w:r>
+      <w:r>
+        <w:rPr>
+          <w:b/>
+        </w:rPr>
+        <w:t>Bucket T</w:t>
+      </w:r>
+      <w:r>
+        <w:t xml:space="preserve"> at</w:t>
+      </w:r>
+    </w:p>
+    <w:p>
+      <w:r>
+        <w:t xml:space="preserve">F ≈ 0.94 — it is a named theorem in the NCERT chapter body. Table gives </w:t>
+      </w:r>
+      <w:r>
+        <w:rPr>
+          <w:b/>
+        </w:rPr>
+        <w:t>R&amp;U</w:t>
+      </w:r>
+      <w:r>
+        <w:t>. Correct: the student is reproducing a proof they were taught line by line.</w:t>
+      </w:r>
+    </w:p>
+    <w:p>
+      <w:pPr>
+        <w:pStyle w:val="ListBullet"/>
+      </w:pPr>
+      <w:r>
+        <w:rPr>
+          <w:i/>
+        </w:rPr>
+        <w:t>"Prove that 3 + 2√5 is irrational."</w:t>
+      </w:r>
+      <w:r>
+        <w:t xml:space="preserve"> → same action, F ≈ 0.70 against Bucket E. Table gives</w:t>
+      </w:r>
+    </w:p>
+    <w:p>
+      <w:r>
+        <w:rPr>
+          <w:b/>
+        </w:rPr>
+        <w:t>AP</w:t>
+      </w:r>
+      <w:r>
+        <w:t>. Correct: the method is known, the object is new.</w:t>
+      </w:r>
+    </w:p>
+    <w:p>
+      <w:pPr>
+        <w:pStyle w:val="ListBullet"/>
+      </w:pPr>
+      <w:r>
+        <w:rPr>
+          <w:i/>
+        </w:rPr>
+        <w:t>"Prove that the parallelogram circumscribing a circle is a rhombus."</w:t>
+      </w:r>
+      <w:r>
+        <w:t xml:space="preserve"> → PROVE, F &lt; 0.55 if it is</w:t>
+      </w:r>
+    </w:p>
+    <w:p>
+      <w:r>
+        <w:t xml:space="preserve">not in the taught set. Table gives </w:t>
+      </w:r>
+      <w:r>
+        <w:rPr>
+          <w:b/>
+        </w:rPr>
+        <w:t>AEC</w:t>
+      </w:r>
+      <w:r>
+        <w:t>.</w:t>
+      </w:r>
+    </w:p>
+    <w:p>
+      <w:r>
+        <w:t>The table is small, auditable, and a head of department can argue with it — which is exactly what you want from a rule that assigns a contested label.</w:t>
+      </w:r>
+    </w:p>
+    <w:p>
+      <w:r>
+        <w:rPr>
+          <w:b/>
+        </w:rPr>
+        <w:t>Step 4 — for the taught-verbatim bucket, stop doing retrieval and just enumerate it</w:t>
+      </w:r>
+    </w:p>
+    <w:p>
+      <w:r>
+        <w:t xml:space="preserve">This is the practical shortcut that makes the whole thing cheap. </w:t>
+      </w:r>
+      <w:r>
+        <w:rPr>
+          <w:b/>
+        </w:rPr>
+        <w:t>For Class X Maths there are only about 40–60 named theorems and standard proofs.</w:t>
+      </w:r>
+      <w:r>
+        <w:t xml:space="preserve"> Enumerate them once into a table:</w:t>
+      </w:r>
+    </w:p>
+    <w:p>
+      <w:pPr>
+        <w:ind w:left="288"/>
+      </w:pPr>
+      <w:r>
+        <w:rPr>
+          <w:rFonts w:ascii="Consolas" w:hAnsi="Consolas"/>
+          <w:sz w:val="17"/>
+        </w:rPr>
+        <w:t>create table canonical_procedure (</w:t>
+        <w:br/>
+        <w:t xml:space="preserve">  id            uuid primary key,</w:t>
+        <w:br/>
+        <w:t xml:space="preserve">  curriculum_version text not null,      -- 'CBSE-2026-27'</w:t>
+        <w:br/>
+        <w:t xml:space="preserve">  subject_id    uuid not null,</w:t>
+        <w:br/>
+        <w:t xml:space="preserve">  chapter_id    uuid not null,</w:t>
+        <w:br/>
+        <w:t xml:space="preserve">  name          text not null,           -- 'Irrationality of root 5'</w:t>
+        <w:br/>
+        <w:t xml:space="preserve">  canonical_stem text not null,          -- for embedding + hashing</w:t>
+        <w:br/>
+        <w:t xml:space="preserve">  taught_verbatim boolean not null,      -- true =&gt; Bucket T</w:t>
+        <w:br/>
+        <w:t xml:space="preserve">  aliases       text[]                   -- common rewordings, incl. HI/TA</w:t>
+        <w:br/>
+        <w:t>);</w:t>
+      </w:r>
+    </w:p>
+    <w:p>
+      <w:r>
+        <w:t>Seed rows for Class X Maths: irrationality of √2 / √3 / √5, Fundamental Theorem of Arithmetic, relationship between zeroes and coefficients, Basic Proportionality Theorem and its converse, Pythagoras and its converse, tangent ⟂ radius, equal tangents from an external point, area of a sector, distance and section formulas, sin²θ + cos²θ = 1 and the derived identities, nth term and sum of an AP.</w:t>
+      </w:r>
+    </w:p>
+    <w:p>
+      <w:r>
+        <w:t xml:space="preserve">That is </w:t>
+      </w:r>
+      <w:r>
+        <w:rPr>
+          <w:b/>
+        </w:rPr>
+        <w:t>one day of work, once</w:t>
+      </w:r>
+      <w:r>
+        <w:t>, reusable across every school and every year the syllabus is unchanged. For those items the familiarity signal is not fuzzy retrieval at all — it is an exact lookup, deterministic and free.</w:t>
+      </w:r>
+    </w:p>
+    <w:p>
+      <w:r>
+        <w:rPr>
+          <w:b/>
+        </w:rPr>
+        <w:t>Step 5 — let response data falsify the label later</w:t>
+      </w:r>
+    </w:p>
+    <w:p>
+      <w:r>
+        <w:t>Once a paper has been attempted, item difficulty gives you a free third opinion. Across a class, R&amp;U items should on average be easier than AP items, which should be easier than AEC items. An item whose difficulty (p-value) sits two standard deviations out of place for its assigned tier is routed back for re-review. This costs no human time and it catches exactly the systematic errors a lexicon makes.</w:t>
+      </w:r>
+    </w:p>
+    <w:p>
+      <w:r>
+        <w:rPr>
+          <w:b/>
+        </w:rPr>
+        <w:t>Step 6 — and let the school win the argument</w:t>
+      </w:r>
+    </w:p>
+    <w:p>
+      <w:r>
+        <w:t>Reasonable teachers genuinely disagree on tier. Overrides are stored per school in the taxonomy, not patched into the model. If a school insists that proving √5 is Applying for their students, their taxonomy says so, their reports follow it, and their Question Library records who decided and when.</w:t>
       </w:r>
     </w:p>
     <w:p>

</xml_diff>